<commit_message>
Add draft project check steps to report template
</commit_message>
<xml_diff>
--- a/docs/PR3_ScrumPlan_MVP.docx
+++ b/docs/PR3_ScrumPlan_MVP.docx
@@ -6729,23 +6729,7 @@
           <w:sz w:val="24"/>
           <w:szCs w:val="24"/>
         </w:rPr>
-        <w:t>Система дозволяє створювати та переглядати навчальні курси</w:t>
-      </w:r>
-      <w:r>
-        <w:rPr>
-          <w:color w:val="000000"/>
-          <w:sz w:val="24"/>
-          <w:szCs w:val="24"/>
-        </w:rPr>
-        <w:t xml:space="preserve">. </w:t>
-      </w:r>
-      <w:r>
-        <w:rPr>
-          <w:color w:val="000000"/>
-          <w:sz w:val="24"/>
-          <w:szCs w:val="24"/>
-        </w:rPr>
-        <w:t>Без курсів продукт не має змісту, адже немає навчального контенту. Завдання: дати структуру знань у вигляді тем та уроків.</w:t>
+        <w:t>Система дозволяє створювати та переглядати навчальні курси. Без курсів продукт не має змісту, адже немає навчального контенту. Завдання: дати структуру знань у вигляді тем та уроків.</w:t>
       </w:r>
     </w:p>
     <w:p>
@@ -6775,23 +6759,7 @@
           <w:sz w:val="24"/>
           <w:szCs w:val="24"/>
         </w:rPr>
-        <w:t>Користувач може відстежувати свій прогрес</w:t>
-      </w:r>
-      <w:r>
-        <w:rPr>
-          <w:color w:val="000000"/>
-          <w:sz w:val="24"/>
-          <w:szCs w:val="24"/>
-        </w:rPr>
-        <w:t xml:space="preserve">. </w:t>
-      </w:r>
-      <w:r>
-        <w:rPr>
-          <w:color w:val="000000"/>
-          <w:sz w:val="24"/>
-          <w:szCs w:val="24"/>
-        </w:rPr>
-        <w:t>Без відображення прогресу користувач не розуміє, наскільки він просунувся. Завдання: мотивувати та допомогти планувати навчання.</w:t>
+        <w:t>Користувач може відстежувати свій прогрес. Без відображення прогресу користувач не розуміє, наскільки він просунувся. Завдання: мотивувати та допомогти планувати навчання.</w:t>
       </w:r>
     </w:p>
     <w:p>
@@ -6823,25 +6791,7 @@
           <w:sz w:val="24"/>
           <w:szCs w:val="24"/>
         </w:rPr>
-        <w:t>Система дозволяє додавати та зберігати навчальні матеріали</w:t>
-      </w:r>
-      <w:r>
-        <w:rPr>
-          <w:color w:val="000000"/>
-          <w:spacing w:val="-8"/>
-          <w:sz w:val="24"/>
-          <w:szCs w:val="24"/>
-        </w:rPr>
-        <w:t xml:space="preserve">. </w:t>
-      </w:r>
-      <w:r>
-        <w:rPr>
-          <w:color w:val="000000"/>
-          <w:spacing w:val="-8"/>
-          <w:sz w:val="24"/>
-          <w:szCs w:val="24"/>
-        </w:rPr>
-        <w:t>Без матеріалів немає що вивчати. Завдання: надати доступ до текстів, відео та інших ресурсів у зручному форматі.</w:t>
+        <w:t>Система дозволяє додавати та зберігати навчальні матеріали. Без матеріалів немає що вивчати. Завдання: надати доступ до текстів, відео та інших ресурсів у зручному форматі.</w:t>
       </w:r>
     </w:p>
     <w:p>
@@ -6871,23 +6821,7 @@
           <w:sz w:val="24"/>
           <w:szCs w:val="24"/>
         </w:rPr>
-        <w:t>Користувач може проходити інтерактивні тести чи завдання</w:t>
-      </w:r>
-      <w:r>
-        <w:rPr>
-          <w:color w:val="000000"/>
-          <w:sz w:val="24"/>
-          <w:szCs w:val="24"/>
-        </w:rPr>
-        <w:t xml:space="preserve">. </w:t>
-      </w:r>
-      <w:r>
-        <w:rPr>
-          <w:color w:val="000000"/>
-          <w:sz w:val="24"/>
-          <w:szCs w:val="24"/>
-        </w:rPr>
-        <w:t>Без перевірки знань навчання не має практичного результату. Завдання: дати можливість оцінити рівень засвоєння матеріалу.</w:t>
+        <w:t>Користувач може проходити інтерактивні тести чи завдання. Без перевірки знань навчання не має практичного результату. Завдання: дати можливість оцінити рівень засвоєння матеріалу.</w:t>
       </w:r>
     </w:p>
     <w:p>
@@ -6919,25 +6853,7 @@
           <w:sz w:val="24"/>
           <w:szCs w:val="24"/>
         </w:rPr>
-        <w:t>Система дозволяє формувати базову статистику</w:t>
-      </w:r>
-      <w:r>
-        <w:rPr>
-          <w:color w:val="000000"/>
-          <w:spacing w:val="-8"/>
-          <w:sz w:val="24"/>
-          <w:szCs w:val="24"/>
-        </w:rPr>
-        <w:t xml:space="preserve">. </w:t>
-      </w:r>
-      <w:r>
-        <w:rPr>
-          <w:color w:val="000000"/>
-          <w:spacing w:val="-8"/>
-          <w:sz w:val="24"/>
-          <w:szCs w:val="24"/>
-        </w:rPr>
-        <w:t>Без статистики неможливо зрозуміти ефективність навчання. Завдання: показати кількість завершених уроків та результати тестів.</w:t>
+        <w:t>Система дозволяє формувати базову статистику. Без статистики неможливо зрозуміти ефективність навчання. Завдання: показати кількість завершених уроків та результати тестів.</w:t>
       </w:r>
     </w:p>
     <w:p>
@@ -6967,23 +6883,7 @@
           <w:sz w:val="24"/>
           <w:szCs w:val="24"/>
         </w:rPr>
-        <w:t>Користувач може отримувати повідомлення про нові матеріали чи дедлайни</w:t>
-      </w:r>
-      <w:r>
-        <w:rPr>
-          <w:color w:val="000000"/>
-          <w:sz w:val="24"/>
-          <w:szCs w:val="24"/>
-        </w:rPr>
-        <w:t xml:space="preserve">. </w:t>
-      </w:r>
-      <w:r>
-        <w:rPr>
-          <w:color w:val="000000"/>
-          <w:sz w:val="24"/>
-          <w:szCs w:val="24"/>
-        </w:rPr>
-        <w:t>Без нагадувань користувач може пропустити важливі оновлення. Завдання: підтримувати регулярність навчання та інформувати про зміни.</w:t>
+        <w:t>Користувач може отримувати повідомлення про нові матеріали чи дедлайни. Без нагадувань користувач може пропустити важливі оновлення. Завдання: підтримувати регулярність навчання та інформувати про зміни.</w:t>
       </w:r>
     </w:p>
     <w:p>
@@ -7132,15 +7032,7 @@
           <w:sz w:val="24"/>
           <w:szCs w:val="24"/>
         </w:rPr>
-        <w:t xml:space="preserve">Таблиця 3.2 – </w:t>
-      </w:r>
-      <w:r>
-        <w:rPr>
-          <w:color w:val="000000"/>
-          <w:sz w:val="24"/>
-          <w:szCs w:val="24"/>
-        </w:rPr>
-        <w:t>Пріоритети функцій</w:t>
+        <w:t>Таблиця 3.2 – Пріоритети функцій</w:t>
       </w:r>
     </w:p>
     <w:tbl>
@@ -8619,6 +8511,241 @@
           <w:szCs w:val="24"/>
         </w:rPr>
         <w:t>Базова комунікація між викладачем і студентом</w:t>
+      </w:r>
+    </w:p>
+    <w:p>
+      <w:pPr>
+        <w:pBdr>
+          <w:top w:val="nil"/>
+          <w:left w:val="nil"/>
+          <w:bottom w:val="nil"/>
+          <w:right w:val="nil"/>
+          <w:between w:val="nil"/>
+        </w:pBdr>
+        <w:spacing w:before="120" w:after="120"/>
+        <w:jc w:val="center"/>
+        <w:rPr>
+          <w:b/>
+          <w:bCs/>
+          <w:color w:val="000000"/>
+          <w:sz w:val="24"/>
+          <w:szCs w:val="24"/>
+        </w:rPr>
+      </w:pPr>
+      <w:r>
+        <w:rPr>
+          <w:b/>
+          <w:bCs/>
+          <w:color w:val="000000"/>
+          <w:sz w:val="24"/>
+          <w:szCs w:val="24"/>
+        </w:rPr>
+        <w:t>П</w:t>
+      </w:r>
+      <w:r>
+        <w:rPr>
+          <w:b/>
+          <w:bCs/>
+          <w:color w:val="000000"/>
+          <w:sz w:val="24"/>
+          <w:szCs w:val="24"/>
+        </w:rPr>
+        <w:t>лан запуску/перевірки</w:t>
+      </w:r>
+      <w:r>
+        <w:rPr>
+          <w:b/>
+          <w:bCs/>
+          <w:color w:val="000000"/>
+          <w:sz w:val="24"/>
+          <w:szCs w:val="24"/>
+        </w:rPr>
+        <w:t xml:space="preserve"> </w:t>
+      </w:r>
+      <w:proofErr w:type="spellStart"/>
+      <w:r>
+        <w:rPr>
+          <w:b/>
+          <w:bCs/>
+          <w:color w:val="000000"/>
+          <w:sz w:val="24"/>
+          <w:szCs w:val="24"/>
+        </w:rPr>
+        <w:t>проекта</w:t>
+      </w:r>
+      <w:proofErr w:type="spellEnd"/>
+    </w:p>
+    <w:p>
+      <w:pPr>
+        <w:pStyle w:val="aff8"/>
+        <w:numPr>
+          <w:ilvl w:val="0"/>
+          <w:numId w:val="16"/>
+        </w:numPr>
+        <w:pBdr>
+          <w:top w:val="nil"/>
+          <w:left w:val="nil"/>
+          <w:bottom w:val="nil"/>
+          <w:right w:val="nil"/>
+          <w:between w:val="nil"/>
+        </w:pBdr>
+        <w:ind w:left="709"/>
+        <w:jc w:val="both"/>
+        <w:rPr>
+          <w:color w:val="000000"/>
+          <w:sz w:val="24"/>
+          <w:szCs w:val="24"/>
+        </w:rPr>
+      </w:pPr>
+      <w:r>
+        <w:rPr>
+          <w:color w:val="000000"/>
+          <w:sz w:val="24"/>
+          <w:szCs w:val="24"/>
+        </w:rPr>
+        <w:t>Відкрити головну сторінку сервісу та перевірити роботу форми реєстрації та входу.</w:t>
+      </w:r>
+    </w:p>
+    <w:p>
+      <w:pPr>
+        <w:pStyle w:val="aff8"/>
+        <w:numPr>
+          <w:ilvl w:val="0"/>
+          <w:numId w:val="16"/>
+        </w:numPr>
+        <w:pBdr>
+          <w:top w:val="nil"/>
+          <w:left w:val="nil"/>
+          <w:bottom w:val="nil"/>
+          <w:right w:val="nil"/>
+          <w:between w:val="nil"/>
+        </w:pBdr>
+        <w:ind w:left="709"/>
+        <w:jc w:val="both"/>
+        <w:rPr>
+          <w:color w:val="000000"/>
+          <w:sz w:val="24"/>
+          <w:szCs w:val="24"/>
+        </w:rPr>
+      </w:pPr>
+      <w:r>
+        <w:rPr>
+          <w:color w:val="000000"/>
+          <w:sz w:val="24"/>
+          <w:szCs w:val="24"/>
+        </w:rPr>
+        <w:t xml:space="preserve">Створити тестовий курс із темами та </w:t>
+      </w:r>
+      <w:proofErr w:type="spellStart"/>
+      <w:r>
+        <w:rPr>
+          <w:color w:val="000000"/>
+          <w:sz w:val="24"/>
+          <w:szCs w:val="24"/>
+        </w:rPr>
+        <w:t>уроками</w:t>
+      </w:r>
+      <w:proofErr w:type="spellEnd"/>
+      <w:r>
+        <w:rPr>
+          <w:color w:val="000000"/>
+          <w:sz w:val="24"/>
+          <w:szCs w:val="24"/>
+        </w:rPr>
+        <w:t xml:space="preserve"> та переконатися, що він відображається коректно.</w:t>
+      </w:r>
+    </w:p>
+    <w:p>
+      <w:pPr>
+        <w:pStyle w:val="aff8"/>
+        <w:numPr>
+          <w:ilvl w:val="0"/>
+          <w:numId w:val="16"/>
+        </w:numPr>
+        <w:pBdr>
+          <w:top w:val="nil"/>
+          <w:left w:val="nil"/>
+          <w:bottom w:val="nil"/>
+          <w:right w:val="nil"/>
+          <w:between w:val="nil"/>
+        </w:pBdr>
+        <w:ind w:left="709"/>
+        <w:jc w:val="both"/>
+        <w:rPr>
+          <w:color w:val="000000"/>
+          <w:sz w:val="24"/>
+          <w:szCs w:val="24"/>
+        </w:rPr>
+      </w:pPr>
+      <w:r>
+        <w:rPr>
+          <w:color w:val="000000"/>
+          <w:sz w:val="24"/>
+          <w:szCs w:val="24"/>
+        </w:rPr>
+        <w:t>Пройти кілька уроків і перевірити відображення прогресу та відсотка виконання.</w:t>
+      </w:r>
+    </w:p>
+    <w:p>
+      <w:pPr>
+        <w:pStyle w:val="aff8"/>
+        <w:numPr>
+          <w:ilvl w:val="0"/>
+          <w:numId w:val="16"/>
+        </w:numPr>
+        <w:pBdr>
+          <w:top w:val="nil"/>
+          <w:left w:val="nil"/>
+          <w:bottom w:val="nil"/>
+          <w:right w:val="nil"/>
+          <w:between w:val="nil"/>
+        </w:pBdr>
+        <w:ind w:left="709"/>
+        <w:jc w:val="both"/>
+        <w:rPr>
+          <w:color w:val="000000"/>
+          <w:sz w:val="24"/>
+          <w:szCs w:val="24"/>
+        </w:rPr>
+      </w:pPr>
+      <w:r>
+        <w:rPr>
+          <w:color w:val="000000"/>
+          <w:sz w:val="24"/>
+          <w:szCs w:val="24"/>
+        </w:rPr>
+        <w:t>Додати навчальні матеріали (текст, відео, тест) та протестувати їх доступність і роботу інтерактивних завдань.</w:t>
+      </w:r>
+    </w:p>
+    <w:p>
+      <w:pPr>
+        <w:pStyle w:val="aff8"/>
+        <w:numPr>
+          <w:ilvl w:val="0"/>
+          <w:numId w:val="16"/>
+        </w:numPr>
+        <w:pBdr>
+          <w:top w:val="nil"/>
+          <w:left w:val="nil"/>
+          <w:bottom w:val="nil"/>
+          <w:right w:val="nil"/>
+          <w:between w:val="nil"/>
+        </w:pBdr>
+        <w:ind w:left="709"/>
+        <w:jc w:val="both"/>
+        <w:rPr>
+          <w:color w:val="000000"/>
+          <w:sz w:val="24"/>
+          <w:szCs w:val="24"/>
+        </w:rPr>
+      </w:pPr>
+      <w:r>
+        <w:rPr>
+          <w:color w:val="000000"/>
+          <w:sz w:val="24"/>
+          <w:szCs w:val="24"/>
+        </w:rPr>
+        <w:t>Перевірити формування статистики та отримання повідомлень про нові матеріали чи дедлайни.</w:t>
       </w:r>
     </w:p>
     <w:p>
@@ -10784,6 +10911,92 @@
     </w:lvl>
   </w:abstractNum>
   <w:abstractNum w:abstractNumId="14" w15:restartNumberingAfterBreak="0">
+    <w:nsid w:val="773D3F69"/>
+    <w:multiLevelType w:val="hybridMultilevel"/>
+    <w:tmpl w:val="BB342A88"/>
+    <w:lvl w:ilvl="0" w:tplc="0422000F">
+      <w:start w:val="1"/>
+      <w:numFmt w:val="decimal"/>
+      <w:lvlText w:val="%1."/>
+      <w:lvlJc w:val="left"/>
+      <w:pPr>
+        <w:ind w:left="360" w:hanging="360"/>
+      </w:pPr>
+    </w:lvl>
+    <w:lvl w:ilvl="1" w:tplc="04220019">
+      <w:start w:val="1"/>
+      <w:numFmt w:val="lowerLetter"/>
+      <w:lvlText w:val="%2."/>
+      <w:lvlJc w:val="left"/>
+      <w:pPr>
+        <w:ind w:left="1080" w:hanging="360"/>
+      </w:pPr>
+    </w:lvl>
+    <w:lvl w:ilvl="2" w:tplc="0422001B">
+      <w:start w:val="1"/>
+      <w:numFmt w:val="lowerRoman"/>
+      <w:lvlText w:val="%3."/>
+      <w:lvlJc w:val="right"/>
+      <w:pPr>
+        <w:ind w:left="1800" w:hanging="180"/>
+      </w:pPr>
+    </w:lvl>
+    <w:lvl w:ilvl="3" w:tplc="0422000F">
+      <w:start w:val="1"/>
+      <w:numFmt w:val="decimal"/>
+      <w:lvlText w:val="%4."/>
+      <w:lvlJc w:val="left"/>
+      <w:pPr>
+        <w:ind w:left="2520" w:hanging="360"/>
+      </w:pPr>
+    </w:lvl>
+    <w:lvl w:ilvl="4" w:tplc="04220019" w:tentative="1">
+      <w:start w:val="1"/>
+      <w:numFmt w:val="lowerLetter"/>
+      <w:lvlText w:val="%5."/>
+      <w:lvlJc w:val="left"/>
+      <w:pPr>
+        <w:ind w:left="3240" w:hanging="360"/>
+      </w:pPr>
+    </w:lvl>
+    <w:lvl w:ilvl="5" w:tplc="0422001B" w:tentative="1">
+      <w:start w:val="1"/>
+      <w:numFmt w:val="lowerRoman"/>
+      <w:lvlText w:val="%6."/>
+      <w:lvlJc w:val="right"/>
+      <w:pPr>
+        <w:ind w:left="3960" w:hanging="180"/>
+      </w:pPr>
+    </w:lvl>
+    <w:lvl w:ilvl="6" w:tplc="0422000F" w:tentative="1">
+      <w:start w:val="1"/>
+      <w:numFmt w:val="decimal"/>
+      <w:lvlText w:val="%7."/>
+      <w:lvlJc w:val="left"/>
+      <w:pPr>
+        <w:ind w:left="4680" w:hanging="360"/>
+      </w:pPr>
+    </w:lvl>
+    <w:lvl w:ilvl="7" w:tplc="04220019" w:tentative="1">
+      <w:start w:val="1"/>
+      <w:numFmt w:val="lowerLetter"/>
+      <w:lvlText w:val="%8."/>
+      <w:lvlJc w:val="left"/>
+      <w:pPr>
+        <w:ind w:left="5400" w:hanging="360"/>
+      </w:pPr>
+    </w:lvl>
+    <w:lvl w:ilvl="8" w:tplc="0422001B" w:tentative="1">
+      <w:start w:val="1"/>
+      <w:numFmt w:val="lowerRoman"/>
+      <w:lvlText w:val="%9."/>
+      <w:lvlJc w:val="right"/>
+      <w:pPr>
+        <w:ind w:left="6120" w:hanging="180"/>
+      </w:pPr>
+    </w:lvl>
+  </w:abstractNum>
+  <w:abstractNum w:abstractNumId="15" w15:restartNumberingAfterBreak="0">
     <w:nsid w:val="7D167EA3"/>
     <w:multiLevelType w:val="hybridMultilevel"/>
     <w:tmpl w:val="054807B8"/>
@@ -10897,7 +11110,7 @@
     <w:abstractNumId w:val="2"/>
   </w:num>
   <w:num w:numId="10">
-    <w:abstractNumId w:val="14"/>
+    <w:abstractNumId w:val="15"/>
   </w:num>
   <w:num w:numId="11">
     <w:abstractNumId w:val="10"/>
@@ -10913,6 +11126,9 @@
   </w:num>
   <w:num w:numId="15">
     <w:abstractNumId w:val="5"/>
+  </w:num>
+  <w:num w:numId="16">
+    <w:abstractNumId w:val="14"/>
   </w:num>
   <w:numIdMacAtCleanup w:val="15"/>
 </w:numbering>
@@ -12970,13 +13186,13 @@
 </file>
 
 <file path=customXml/item2.xml><?xml version="1.0" encoding="utf-8"?>
-<b:Sources xmlns:b="http://schemas.openxmlformats.org/officeDocument/2006/bibliography" xmlns="http://schemas.openxmlformats.org/officeDocument/2006/bibliography" SelectedStyle="\APASixthEditionOfficeOnline.xsl" StyleName="APA" Version="6"/>
+<go:gDocsCustomXmlDataStorage xmlns:go="http://customooxmlschemas.google.com/" xmlns:r="http://schemas.openxmlformats.org/officeDocument/2006/relationships" uri="GoogleDocsCustomDataVersion2">
+  <go:docsCustomData xmlns:go="http://customooxmlschemas.google.com/" roundtripDataSignature="AMtx7miRy1cid9oqHdduhR8wP0GjI6w7cg==">CgMxLjAyDmgubTk0bDJmNzFhajM5Mg5oLmVnMG05ZjUxMWszczIOaC5ibDAzMDhya2I2Z2QyDmgudnU3ZTdkcWtsem4zOAByITFraFpOR05RMzBOY1NaT2wyZTNacEFpWUxuamVkcC14cA==</go:docsCustomData>
+</go:gDocsCustomXmlDataStorage>
 </file>
 
 <file path=customXml/item3.xml><?xml version="1.0" encoding="utf-8"?>
-<go:gDocsCustomXmlDataStorage xmlns:go="http://customooxmlschemas.google.com/" xmlns:r="http://schemas.openxmlformats.org/officeDocument/2006/relationships" uri="GoogleDocsCustomDataVersion2">
-  <go:docsCustomData xmlns:go="http://customooxmlschemas.google.com/" roundtripDataSignature="AMtx7miRy1cid9oqHdduhR8wP0GjI6w7cg==">CgMxLjAyDmgubTk0bDJmNzFhajM5Mg5oLmVnMG05ZjUxMWszczIOaC5ibDAzMDhya2I2Z2QyDmgudnU3ZTdkcWtsem4zOAByITFraFpOR05RMzBOY1NaT2wyZTNacEFpWUxuamVkcC14cA==</go:docsCustomData>
-</go:gDocsCustomXmlDataStorage>
+<b:Sources xmlns:b="http://schemas.openxmlformats.org/officeDocument/2006/bibliography" xmlns="http://schemas.openxmlformats.org/officeDocument/2006/bibliography" SelectedStyle="\APASixthEditionOfficeOnline.xsl" StyleName="APA" Version="6"/>
 </file>
 
 <file path=customXml/itemProps1.xml><?xml version="1.0" encoding="utf-8"?>
@@ -12988,18 +13204,18 @@
 </file>
 
 <file path=customXml/itemProps2.xml><?xml version="1.0" encoding="utf-8"?>
-<ds:datastoreItem xmlns:ds="http://schemas.openxmlformats.org/officeDocument/2006/customXml" ds:itemID="{BC699F6E-CD0B-4C66-93A9-D23A8D4AC8CC}">
-  <ds:schemaRefs>
-    <ds:schemaRef ds:uri="http://schemas.openxmlformats.org/officeDocument/2006/bibliography"/>
-  </ds:schemaRefs>
-</ds:datastoreItem>
-</file>
-
-<file path=customXml/itemProps3.xml><?xml version="1.0" encoding="utf-8"?>
 <ds:datastoreItem xmlns:ds="http://schemas.openxmlformats.org/officeDocument/2006/customXml" ds:itemID="{11111111-1234-1234-1234-123412341234}">
   <ds:schemaRefs>
     <ds:schemaRef ds:uri="http://customooxmlschemas.google.com/"/>
     <ds:schemaRef ds:uri="http://schemas.openxmlformats.org/officeDocument/2006/relationships"/>
   </ds:schemaRefs>
 </ds:datastoreItem>
+</file>
+
+<file path=customXml/itemProps3.xml><?xml version="1.0" encoding="utf-8"?>
+<ds:datastoreItem xmlns:ds="http://schemas.openxmlformats.org/officeDocument/2006/customXml" ds:itemID="{BC699F6E-CD0B-4C66-93A9-D23A8D4AC8CC}">
+  <ds:schemaRefs>
+    <ds:schemaRef ds:uri="http://schemas.openxmlformats.org/officeDocument/2006/bibliography"/>
+  </ds:schemaRefs>
+</ds:datastoreItem>
 </file>
</xml_diff>